<commit_message>
Cover details and a work summary in the report
- Cover: course Internship, course code CSE 4001, date of report
  14-09-2026 (project start), date of submission 04-10-2026
- Report: new section "Work Summary: What We Did and What We Achieved"
  after the plain-language summary
- README and research log updated
</commit_message>
<xml_diff>
--- a/report/assets/cover.docx
+++ b/report/assets/cover.docx
@@ -233,7 +233,7 @@
                 <w:rFonts w:ascii="Calibri" w:hAnsi="Calibri"/>
                 <w:sz w:val="24"/>
               </w:rPr>
-              <w:t>Thesis Course</w:t>
+              <w:t>Internship</w:t>
             </w:r>
           </w:p>
         </w:tc>
@@ -302,6 +302,7 @@
                 <w:rFonts w:ascii="Calibri" w:hAnsi="Calibri"/>
                 <w:sz w:val="24"/>
               </w:rPr>
+              <w:t>CSE 4001</w:t>
             </w:r>
           </w:p>
         </w:tc>
@@ -454,7 +455,7 @@
                 <w:rFonts w:ascii="Calibri" w:hAnsi="Calibri"/>
                 <w:sz w:val="24"/>
               </w:rPr>
-              <w:t>04-10-2026</w:t>
+              <w:t>14-09-2026</w:t>
             </w:r>
           </w:p>
         </w:tc>

</xml_diff>